<commit_message>
Updating document that describes generation according to last changes in the component
</commit_message>
<xml_diff>
--- a/generator/src/main/resources/documents/Variables Generated by CP Generator-V2.docx
+++ b/generator/src/main/resources/documents/Variables Generated by CP Generator-V2.docx
@@ -212,7 +212,16 @@
         <w:t xml:space="preserve"> </w:t>
       </w:r>
       <w:r>
-        <w:t xml:space="preserve">for deploying  </w:t>
+        <w:t>for deploying</w:t>
+      </w:r>
+      <w:r>
+        <w:t xml:space="preserve"> the instances of the</w:t>
+      </w:r>
+      <w:r>
+        <w:t xml:space="preserve"> component</w:t>
+      </w:r>
+      <w:r>
+        <w:t xml:space="preserve"> </w:t>
       </w:r>
       <w:r>
         <w:rPr>
@@ -221,7 +230,13 @@
         <w:t>&lt;nameOfTheComponent&gt;</w:t>
       </w:r>
       <w:r>
-        <w:t xml:space="preserve"> component instances in provider </w:t>
+        <w:t xml:space="preserve"> in </w:t>
+      </w:r>
+      <w:r>
+        <w:t xml:space="preserve">the </w:t>
+      </w:r>
+      <w:r>
+        <w:t xml:space="preserve">provider </w:t>
       </w:r>
       <w:r>
         <w:rPr>
@@ -230,7 +245,37 @@
         <w:t>&lt;idOfTheProvider&gt;</w:t>
       </w:r>
       <w:r>
-        <w:t xml:space="preserve">. The domain of this variable is determined but the minimal and maximal number of the component instances defined by a CAMEL </w:t>
+        <w:t>.</w:t>
+      </w:r>
+      <w:r>
+        <w:t xml:space="preserve"> Please notice that for each VM instance, a component instance will be created.</w:t>
+      </w:r>
+      <w:r>
+        <w:t xml:space="preserve"> The domain of this variable is</w:t>
+      </w:r>
+      <w:r>
+        <w:t xml:space="preserve"> [0, MAX], where</w:t>
+      </w:r>
+      <w:r>
+        <w:t xml:space="preserve"> </w:t>
+      </w:r>
+      <w:r>
+        <w:t>MAX</w:t>
+      </w:r>
+      <w:r>
+        <w:t xml:space="preserve"> </w:t>
+      </w:r>
+      <w:r>
+        <w:t>is</w:t>
+      </w:r>
+      <w:r>
+        <w:t xml:space="preserve"> </w:t>
+      </w:r>
+      <w:r>
+        <w:t xml:space="preserve">the </w:t>
+      </w:r>
+      <w:r>
+        <w:t xml:space="preserve">maximal number of the component instances defined by a CAMEL </w:t>
       </w:r>
       <w:r>
         <w:rPr>
@@ -239,14 +284,56 @@
         <w:t>Horizontal Scale requirement</w:t>
       </w:r>
       <w:r>
-        <w:t xml:space="preserve">. If the component does not have a related horizontal scale requirement, 0 and 128 are assigned as minimal and maximal values respectively.     </w:t>
-      </w:r>
-      <w:r>
-        <w:rPr>
-          <w:b/>
-        </w:rPr>
+        <w:t>, which is related to</w:t>
+      </w:r>
+      <w:r>
         <w:t xml:space="preserve"> </w:t>
       </w:r>
+      <w:r>
+        <w:rPr>
+          <w:rFonts w:ascii="Courier New" w:hAnsi="Courier New" w:cs="Courier New"/>
+        </w:rPr>
+        <w:t>&lt;nameOfTheComponent&gt;</w:t>
+      </w:r>
+      <w:r>
+        <w:t xml:space="preserve">. If the component does not have a related horizontal scale requirement, </w:t>
+      </w:r>
+      <w:r>
+        <w:t>[</w:t>
+      </w:r>
+      <w:r>
+        <w:t>0</w:t>
+      </w:r>
+      <w:r>
+        <w:t>,</w:t>
+      </w:r>
+      <w:r>
+        <w:t>1</w:t>
+      </w:r>
+      <w:r>
+        <w:t>]</w:t>
+      </w:r>
+      <w:r>
+        <w:t xml:space="preserve"> </w:t>
+      </w:r>
+      <w:r>
+        <w:t>is</w:t>
+      </w:r>
+      <w:r>
+        <w:t xml:space="preserve"> assigned as </w:t>
+      </w:r>
+      <w:r>
+        <w:t>domain</w:t>
+      </w:r>
+      <w:r>
+        <w:t xml:space="preserve">.     </w:t>
+      </w:r>
+      <w:r>
+        <w:rPr>
+          <w:b/>
+        </w:rPr>
+        <w:t xml:space="preserve"> </w:t>
+      </w:r>
     </w:p>
     <w:p>
       <w:pPr>
@@ -334,19 +421,12 @@
       <w:pPr>
         <w:jc w:val="both"/>
       </w:pPr>
-      <w:proofErr w:type="gramStart"/>
-      <w:r>
-        <w:rPr>
-          <w:rFonts w:ascii="Courier New" w:hAnsi="Courier New" w:cs="Courier New"/>
-        </w:rPr>
-        <w:t>cero</w:t>
-      </w:r>
-      <w:proofErr w:type="gramEnd"/>
-      <w:r>
-        <w:rPr>
-          <w:rFonts w:ascii="Courier New" w:hAnsi="Courier New" w:cs="Courier New"/>
-        </w:rPr>
-        <w:t>_constant</w:t>
+      <w:r>
+        <w:rPr>
+          <w:rFonts w:ascii="Courier New" w:hAnsi="Courier New" w:cs="Courier New"/>
+        </w:rPr>
+        <w:lastRenderedPageBreak/>
+        <w:t>cero_constant</w:t>
       </w:r>
       <w:r>
         <w:t>:</w:t>
@@ -366,19 +446,11 @@
       <w:pPr>
         <w:jc w:val="both"/>
       </w:pPr>
-      <w:proofErr w:type="gramStart"/>
-      <w:r>
-        <w:rPr>
-          <w:rFonts w:ascii="Courier New" w:hAnsi="Courier New" w:cs="Courier New"/>
-        </w:rPr>
-        <w:t>one</w:t>
-      </w:r>
-      <w:proofErr w:type="gramEnd"/>
-      <w:r>
-        <w:rPr>
-          <w:rFonts w:ascii="Courier New" w:hAnsi="Courier New" w:cs="Courier New"/>
-        </w:rPr>
-        <w:t>_constant</w:t>
+      <w:r>
+        <w:rPr>
+          <w:rFonts w:ascii="Courier New" w:hAnsi="Courier New" w:cs="Courier New"/>
+        </w:rPr>
+        <w:t>one_constant</w:t>
       </w:r>
       <w:r>
         <w:t>: Integer constant for “1” value.</w:t>
@@ -393,19 +465,11 @@
       <w:pPr>
         <w:jc w:val="both"/>
       </w:pPr>
-      <w:proofErr w:type="gramStart"/>
-      <w:r>
-        <w:rPr>
-          <w:rFonts w:ascii="Courier New" w:hAnsi="Courier New" w:cs="Courier New"/>
-        </w:rPr>
-        <w:t>number</w:t>
-      </w:r>
-      <w:proofErr w:type="gramEnd"/>
-      <w:r>
-        <w:rPr>
-          <w:rFonts w:ascii="Courier New" w:hAnsi="Courier New" w:cs="Courier New"/>
-        </w:rPr>
-        <w:t>_vm_&lt;idOfTheVM&gt;</w:t>
+      <w:r>
+        <w:rPr>
+          <w:rFonts w:ascii="Courier New" w:hAnsi="Courier New" w:cs="Courier New"/>
+        </w:rPr>
+        <w:t>number_vm_&lt;idOfTheVM&gt;</w:t>
       </w:r>
       <w:r>
         <w:t xml:space="preserve">: Maximal number of vm instances that can be created for </w:t>
@@ -414,33 +478,33 @@
         <w:t>_</w:t>
       </w:r>
       <w:r>
-        <w:t xml:space="preserve">&lt;idOfTheVM&gt;. The default value is 1028. Example: </w:t>
-      </w:r>
-    </w:p>
-    <w:p>
-      <w:pPr>
-        <w:jc w:val="both"/>
-      </w:pPr>
-    </w:p>
-    <w:p>
-      <w:pPr>
-        <w:rPr>
-          <w:rFonts w:ascii="Courier New" w:hAnsi="Courier New" w:cs="Courier New"/>
-        </w:rPr>
-      </w:pPr>
-      <w:proofErr w:type="gramStart"/>
-      <w:r>
-        <w:rPr>
-          <w:rFonts w:ascii="Courier New" w:hAnsi="Courier New" w:cs="Courier New"/>
-        </w:rPr>
-        <w:t>number</w:t>
-      </w:r>
-      <w:proofErr w:type="gramEnd"/>
-      <w:r>
-        <w:rPr>
-          <w:rFonts w:ascii="Courier New" w:hAnsi="Courier New" w:cs="Courier New"/>
-        </w:rPr>
-        <w:t>_vm_Germany_GWDG_CoreIntensiveHWReq_UbuntuReq_VM_PROFILE</w:t>
+        <w:t>&lt;idO</w:t>
+      </w:r>
+      <w:r>
+        <w:t>fTheVM&gt;. The default value is 1</w:t>
+      </w:r>
+      <w:bookmarkStart w:id="0" w:name="_GoBack"/>
+      <w:bookmarkEnd w:id="0"/>
+      <w:r>
+        <w:t xml:space="preserve">28. Example: </w:t>
+      </w:r>
+    </w:p>
+    <w:p>
+      <w:pPr>
+        <w:jc w:val="both"/>
+      </w:pPr>
+    </w:p>
+    <w:p>
+      <w:pPr>
+        <w:rPr>
+          <w:rFonts w:ascii="Courier New" w:hAnsi="Courier New" w:cs="Courier New"/>
+        </w:rPr>
+      </w:pPr>
+      <w:r>
+        <w:rPr>
+          <w:rFonts w:ascii="Courier New" w:hAnsi="Courier New" w:cs="Courier New"/>
+        </w:rPr>
+        <w:t>number_vm_Germany_GWDG_CoreIntensiveHWReq_UbuntuReq_VM_PROFILE</w:t>
       </w:r>
     </w:p>
     <w:p>
@@ -630,19 +694,11 @@
       <w:pPr>
         <w:pStyle w:val="ListParagraph"/>
       </w:pPr>
-      <w:proofErr w:type="gramStart"/>
-      <w:r>
-        <w:rPr>
-          <w:rFonts w:ascii="Courier New" w:hAnsi="Courier New" w:cs="Courier New"/>
-        </w:rPr>
-        <w:t>number</w:t>
-      </w:r>
-      <w:proofErr w:type="gramEnd"/>
-      <w:r>
-        <w:rPr>
-          <w:rFonts w:ascii="Courier New" w:hAnsi="Courier New" w:cs="Courier New"/>
-        </w:rPr>
-        <w:t>_vm_Germany_GWDG_CoreIntensiveHWReq_UbuntuReq_VM_PROFILE</w:t>
+      <w:r>
+        <w:rPr>
+          <w:rFonts w:ascii="Courier New" w:hAnsi="Courier New" w:cs="Courier New"/>
+        </w:rPr>
+        <w:t>number_vm_Germany_GWDG_CoreIntensiveHWReq_UbuntuReq_VM_PROFILE</w:t>
       </w:r>
       <w:r>
         <w:rPr>
@@ -888,14 +944,7 @@
         <w:rPr>
           <w:rFonts w:cs="Courier New"/>
         </w:rPr>
-        <w:t xml:space="preserve">For each kind </w:t>
-      </w:r>
-      <w:proofErr w:type="gramStart"/>
-      <w:r>
-        <w:rPr>
-          <w:rFonts w:cs="Courier New"/>
-        </w:rPr>
-        <w:t xml:space="preserve">of  </w:t>
+        <w:t xml:space="preserve">For each kind of  </w:t>
       </w:r>
       <w:r>
         <w:rPr>
@@ -904,7 +953,6 @@
         </w:rPr>
         <w:t>Optimisation</w:t>
       </w:r>
-      <w:proofErr w:type="gramEnd"/>
       <w:r>
         <w:rPr>
           <w:rFonts w:cs="Courier New"/>
@@ -1051,33 +1099,127 @@
         <w:rPr>
           <w:rFonts w:cs="Courier New"/>
         </w:rPr>
+        <w:t xml:space="preserve"> path , where </w:t>
+      </w:r>
+      <w:r>
+        <w:rPr>
+          <w:rFonts w:ascii="Courier New" w:hAnsi="Courier New" w:cs="Courier New"/>
+        </w:rPr>
+        <w:t>&lt;app_id&gt;</w:t>
+      </w:r>
+      <w:r>
+        <w:rPr>
+          <w:rFonts w:cs="Courier New"/>
+        </w:rPr>
+        <w:t xml:space="preserve"> is the identifier of the application.  The identifier of the generated provider model follows the pattern </w:t>
+      </w:r>
+      <w:r>
+        <w:rPr>
+          <w:rFonts w:ascii="Courier New" w:hAnsi="Courier New" w:cs="Courier New"/>
+          <w:b/>
+        </w:rPr>
+        <w:t>&lt;provider_name&gt;_&lt;location&gt;_&lt;id&gt;</w:t>
+      </w:r>
+      <w:r>
+        <w:rPr>
+          <w:rFonts w:cs="Courier New"/>
+        </w:rPr>
+        <w:t xml:space="preserve">, where </w:t>
+      </w:r>
+      <w:r>
+        <w:rPr>
+          <w:rFonts w:ascii="Courier New" w:hAnsi="Courier New" w:cs="Courier New"/>
+        </w:rPr>
+        <w:t>&lt;provider_name&gt;</w:t>
+      </w:r>
+      <w:r>
+        <w:rPr>
+          <w:rFonts w:cs="Courier New"/>
+        </w:rPr>
+        <w:t xml:space="preserve"> is the name of the provider, </w:t>
+      </w:r>
+      <w:r>
+        <w:rPr>
+          <w:rFonts w:ascii="Courier New" w:hAnsi="Courier New" w:cs="Courier New"/>
+        </w:rPr>
+        <w:t>&lt;location&gt;</w:t>
+      </w:r>
+      <w:r>
+        <w:rPr>
+          <w:rFonts w:cs="Courier New"/>
+        </w:rPr>
+        <w:t xml:space="preserve"> is the place where the provider is located and </w:t>
+      </w:r>
+      <w:r>
+        <w:rPr>
+          <w:rFonts w:ascii="Courier New" w:hAnsi="Courier New" w:cs="Courier New"/>
+        </w:rPr>
+        <w:t>&lt;id&gt;</w:t>
+      </w:r>
+      <w:r>
+        <w:rPr>
+          <w:rFonts w:cs="Courier New"/>
+        </w:rPr>
+        <w:t xml:space="preserve"> is a time stamp generated by CP Generator. This provider model identifier is at the end of the variable name. For example, the variable </w:t>
+      </w:r>
+      <w:r>
+        <w:rPr>
+          <w:rFonts w:ascii="Courier New" w:hAnsi="Courier New" w:cs="Courier New"/>
+        </w:rPr>
+        <w:t>U_app_component_ExperimentManager_vm_Germany_GWDG_CoreIntensiveHWReq_UbuntuReq_VM_PROFILE_provider_</w:t>
+      </w:r>
+      <w:r>
+        <w:rPr>
+          <w:rFonts w:ascii="Courier New" w:hAnsi="Courier New" w:cs="Courier New"/>
+          <w:b/>
+        </w:rPr>
+        <w:t>GWDG-Germany-1429108604348</w:t>
+      </w:r>
+      <w:r>
+        <w:rPr>
+          <w:rFonts w:ascii="Courier New" w:hAnsi="Courier New" w:cs="Courier New"/>
+        </w:rPr>
         <w:t xml:space="preserve"> </w:t>
       </w:r>
-      <w:proofErr w:type="gramStart"/>
-      <w:r>
-        <w:rPr>
-          <w:rFonts w:cs="Courier New"/>
-        </w:rPr>
-        <w:t>path ,</w:t>
-      </w:r>
-      <w:proofErr w:type="gramEnd"/>
-      <w:r>
-        <w:rPr>
-          <w:rFonts w:cs="Courier New"/>
-        </w:rPr>
-        <w:t xml:space="preserve"> where </w:t>
-      </w:r>
-      <w:r>
-        <w:rPr>
-          <w:rFonts w:ascii="Courier New" w:hAnsi="Courier New" w:cs="Courier New"/>
-        </w:rPr>
-        <w:t>&lt;app_id&gt;</w:t>
-      </w:r>
-      <w:r>
-        <w:rPr>
-          <w:rFonts w:cs="Courier New"/>
-        </w:rPr>
-        <w:t xml:space="preserve"> is the identifier of the application.  The identifier of the generated provider model follows the pattern </w:t>
+      <w:r>
+        <w:rPr>
+          <w:rFonts w:cs="Courier New"/>
+        </w:rPr>
+        <w:t xml:space="preserve">has a provider with </w:t>
+      </w:r>
+      <w:r>
+        <w:rPr>
+          <w:rFonts w:ascii="Courier New" w:hAnsi="Courier New" w:cs="Courier New"/>
+        </w:rPr>
+        <w:t>GWDG-Germany-1429108604348</w:t>
+      </w:r>
+      <w:r>
+        <w:rPr>
+          <w:rFonts w:cs="Courier New"/>
+        </w:rPr>
+        <w:t xml:space="preserve"> as identifier.  </w:t>
+      </w:r>
+    </w:p>
+    <w:p>
+      <w:pPr>
+        <w:jc w:val="both"/>
+        <w:rPr>
+          <w:rFonts w:cs="Courier New"/>
+        </w:rPr>
+      </w:pPr>
+    </w:p>
+    <w:p>
+      <w:pPr>
+        <w:jc w:val="both"/>
+        <w:rPr>
+          <w:rFonts w:cs="Courier New"/>
+        </w:rPr>
+      </w:pPr>
+      <w:r>
+        <w:rPr>
+          <w:rFonts w:cs="Courier New"/>
+        </w:rPr>
+        <w:t xml:space="preserve">A PaaSage Configuration Model is also created. This model defines the relationships between the CP Variables and the application components, virtual machines and provider models. The PaaSage Configuration Model contains, for each variable in the CP Model, a  PaaSage Variable that have the same identifier. This variable has references to an Application Component, a Provider and a Virtual Machine Profile. The Application Component is related to a concrete Internal Component in the Camel Deployment model and has the same identifier/name. The Provider has </w:t>
       </w:r>
       <w:r>
         <w:rPr>
@@ -1090,60 +1232,83 @@
         <w:rPr>
           <w:rFonts w:cs="Courier New"/>
         </w:rPr>
-        <w:t xml:space="preserve">, where </w:t>
-      </w:r>
-      <w:r>
-        <w:rPr>
-          <w:rFonts w:ascii="Courier New" w:hAnsi="Courier New" w:cs="Courier New"/>
-        </w:rPr>
-        <w:t>&lt;provider_name&gt;</w:t>
-      </w:r>
-      <w:r>
-        <w:rPr>
-          <w:rFonts w:cs="Courier New"/>
-        </w:rPr>
-        <w:t xml:space="preserve"> is the name of the provider, </w:t>
-      </w:r>
-      <w:r>
-        <w:rPr>
-          <w:rFonts w:ascii="Courier New" w:hAnsi="Courier New" w:cs="Courier New"/>
-        </w:rPr>
-        <w:t>&lt;location&gt;</w:t>
-      </w:r>
-      <w:r>
-        <w:rPr>
-          <w:rFonts w:cs="Courier New"/>
-        </w:rPr>
-        <w:t xml:space="preserve"> is the place where the provider is located and </w:t>
-      </w:r>
-      <w:r>
-        <w:rPr>
-          <w:rFonts w:ascii="Courier New" w:hAnsi="Courier New" w:cs="Courier New"/>
-        </w:rPr>
-        <w:t>&lt;id&gt;</w:t>
-      </w:r>
-      <w:r>
-        <w:rPr>
-          <w:rFonts w:cs="Courier New"/>
-        </w:rPr>
-        <w:t xml:space="preserve"> is a time stamp generated by CP Generator. This provider model identifier is at the end of the variable name. For example, the variable </w:t>
-      </w:r>
-      <w:r>
-        <w:rPr>
-          <w:rFonts w:ascii="Courier New" w:hAnsi="Courier New" w:cs="Courier New"/>
-        </w:rPr>
-        <w:t>U_app_component_ExperimentManager_vm_Germany_GWDG_CoreIntensiveHWReq_UbuntuReq_VM_PROFILE_provider_</w:t>
-      </w:r>
-      <w:r>
-        <w:rPr>
-          <w:rFonts w:ascii="Courier New" w:hAnsi="Courier New" w:cs="Courier New"/>
-          <w:b/>
-        </w:rPr>
-        <w:t>GWDG-Germany-1429108604348</w:t>
-      </w:r>
-      <w:r>
-        <w:rPr>
-          <w:rFonts w:ascii="Courier New" w:hAnsi="Courier New" w:cs="Courier New"/>
+        <w:t xml:space="preserve"> as identifier, which is the identigier of the provider model that was stored  under “</w:t>
+      </w:r>
+      <w:r>
+        <w:rPr>
+          <w:rFonts w:ascii="Courier New" w:hAnsi="Courier New" w:cs="Courier New"/>
+          <w:b/>
+        </w:rPr>
+        <w:t>upperware-models/fms/&lt;app_id</w:t>
+      </w:r>
+      <w:r>
+        <w:rPr>
+          <w:rFonts w:cs="Courier New"/>
+        </w:rPr>
+        <w:t xml:space="preserve">”. The Virtual Machine Profile defines the identifier of a VM in the Camel Deployment Model (cf. Provider Dimension attribute).   </w:t>
+      </w:r>
+    </w:p>
+    <w:p>
+      <w:pPr>
+        <w:jc w:val="both"/>
+        <w:rPr>
+          <w:rFonts w:cs="Courier New"/>
+        </w:rPr>
+      </w:pPr>
+      <w:r>
+        <w:rPr>
+          <w:rFonts w:cs="Courier New"/>
+        </w:rPr>
+        <w:t xml:space="preserve">   </w:t>
+      </w:r>
+    </w:p>
+    <w:p>
+      <w:pPr>
+        <w:rPr>
+          <w:rFonts w:cs="Courier New"/>
+          <w:b/>
+        </w:rPr>
+      </w:pPr>
+    </w:p>
+    <w:p>
+      <w:pPr>
+        <w:rPr>
+          <w:rFonts w:cs="Courier New"/>
+          <w:b/>
+        </w:rPr>
+      </w:pPr>
+      <w:r>
+        <w:rPr>
+          <w:rFonts w:cs="Courier New"/>
+          <w:b/>
+        </w:rPr>
+        <w:t xml:space="preserve">References  </w:t>
+      </w:r>
+    </w:p>
+    <w:p>
+      <w:pPr>
+        <w:rPr>
+          <w:rFonts w:ascii="Courier New" w:hAnsi="Courier New" w:cs="Courier New"/>
+        </w:rPr>
+      </w:pPr>
+    </w:p>
+    <w:p>
+      <w:pPr>
+        <w:jc w:val="both"/>
+        <w:rPr>
+          <w:rFonts w:cs="Courier New"/>
+        </w:rPr>
+      </w:pPr>
+      <w:r>
+        <w:rPr>
+          <w:rFonts w:cs="Courier New"/>
+          <w:b/>
+        </w:rPr>
+        <w:t>[Kang et al., 1990]</w:t>
+      </w:r>
+      <w:r>
+        <w:rPr>
+          <w:rFonts w:cs="Courier New"/>
         </w:rPr>
         <w:t xml:space="preserve"> </w:t>
       </w:r>
@@ -1151,190 +1316,8 @@
         <w:rPr>
           <w:rFonts w:cs="Courier New"/>
         </w:rPr>
-        <w:t xml:space="preserve">has a provider with </w:t>
-      </w:r>
-      <w:r>
-        <w:rPr>
-          <w:rFonts w:ascii="Courier New" w:hAnsi="Courier New" w:cs="Courier New"/>
-        </w:rPr>
-        <w:t>GWDG-Germany-1429108604348</w:t>
-      </w:r>
-      <w:r>
-        <w:rPr>
-          <w:rFonts w:cs="Courier New"/>
-        </w:rPr>
-        <w:t xml:space="preserve"> as identifier.  </w:t>
-      </w:r>
-    </w:p>
-    <w:p>
-      <w:pPr>
-        <w:jc w:val="both"/>
-        <w:rPr>
-          <w:rFonts w:cs="Courier New"/>
-        </w:rPr>
-      </w:pPr>
-    </w:p>
-    <w:p>
-      <w:pPr>
-        <w:jc w:val="both"/>
-        <w:rPr>
-          <w:rFonts w:cs="Courier New"/>
-        </w:rPr>
-      </w:pPr>
-      <w:r>
-        <w:rPr>
-          <w:rFonts w:cs="Courier New"/>
-        </w:rPr>
-        <w:t xml:space="preserve">A PaaSage Configuration Model is also created. This model defines the relationships between the CP Variables and the application components, virtual machines and provider models. The PaaSage Configuration Model contains, for each variable in the CP Model, </w:t>
-      </w:r>
-      <w:proofErr w:type="gramStart"/>
-      <w:r>
-        <w:rPr>
-          <w:rFonts w:cs="Courier New"/>
-        </w:rPr>
-        <w:t>a  PaaSage</w:t>
-      </w:r>
-      <w:proofErr w:type="gramEnd"/>
-      <w:r>
-        <w:rPr>
-          <w:rFonts w:cs="Courier New"/>
-        </w:rPr>
-        <w:t xml:space="preserve"> Variable that have the same identifier. This variable has references to an Application Component, a Provider and a Virtual Machine Profile. The Application Component is related to a concrete Internal Component in the Camel Deployment model and has the same identifier/name. The Provider has </w:t>
-      </w:r>
-      <w:r>
-        <w:rPr>
-          <w:rFonts w:ascii="Courier New" w:hAnsi="Courier New" w:cs="Courier New"/>
-          <w:b/>
-        </w:rPr>
-        <w:t>&lt;provider_name&gt;_&lt;location&gt;_&lt;id&gt;</w:t>
-      </w:r>
-      <w:r>
-        <w:rPr>
-          <w:rFonts w:cs="Courier New"/>
-        </w:rPr>
-        <w:t xml:space="preserve"> as identifier, which is the identigier of the provider model that was </w:t>
-      </w:r>
-      <w:proofErr w:type="gramStart"/>
-      <w:r>
-        <w:rPr>
-          <w:rFonts w:cs="Courier New"/>
-        </w:rPr>
-        <w:t>stored  under</w:t>
-      </w:r>
-      <w:proofErr w:type="gramEnd"/>
-      <w:r>
-        <w:rPr>
-          <w:rFonts w:cs="Courier New"/>
-        </w:rPr>
-        <w:t xml:space="preserve"> “</w:t>
-      </w:r>
-      <w:r>
-        <w:rPr>
-          <w:rFonts w:ascii="Courier New" w:hAnsi="Courier New" w:cs="Courier New"/>
-          <w:b/>
-        </w:rPr>
-        <w:t>upperware-models/fms/&lt;app_id</w:t>
-      </w:r>
-      <w:r>
-        <w:rPr>
-          <w:rFonts w:cs="Courier New"/>
-        </w:rPr>
-        <w:t xml:space="preserve">”. The Virtual Machine Profile defines the identifier of a VM in the Camel Deployment Model (cf. Provider Dimension attribute).   </w:t>
-      </w:r>
-    </w:p>
-    <w:p>
-      <w:pPr>
-        <w:jc w:val="both"/>
-        <w:rPr>
-          <w:rFonts w:cs="Courier New"/>
-        </w:rPr>
-      </w:pPr>
-      <w:r>
-        <w:rPr>
-          <w:rFonts w:cs="Courier New"/>
-        </w:rPr>
-        <w:t xml:space="preserve">   </w:t>
-      </w:r>
-    </w:p>
-    <w:p>
-      <w:pPr>
-        <w:rPr>
-          <w:rFonts w:cs="Courier New"/>
-          <w:b/>
-        </w:rPr>
-      </w:pPr>
-    </w:p>
-    <w:p>
-      <w:pPr>
-        <w:rPr>
-          <w:rFonts w:cs="Courier New"/>
-          <w:b/>
-        </w:rPr>
-      </w:pPr>
-      <w:r>
-        <w:rPr>
-          <w:rFonts w:cs="Courier New"/>
-          <w:b/>
-        </w:rPr>
-        <w:t xml:space="preserve">References  </w:t>
-      </w:r>
-    </w:p>
-    <w:p>
-      <w:pPr>
-        <w:rPr>
-          <w:rFonts w:ascii="Courier New" w:hAnsi="Courier New" w:cs="Courier New"/>
-        </w:rPr>
-      </w:pPr>
-    </w:p>
-    <w:p>
-      <w:pPr>
-        <w:jc w:val="both"/>
-        <w:rPr>
-          <w:rFonts w:cs="Courier New"/>
-        </w:rPr>
-      </w:pPr>
-      <w:r>
-        <w:rPr>
-          <w:rFonts w:cs="Courier New"/>
-          <w:b/>
-        </w:rPr>
-        <w:t>[Kang et al., 1990]</w:t>
-      </w:r>
-      <w:r>
-        <w:rPr>
-          <w:rFonts w:cs="Courier New"/>
-        </w:rPr>
-        <w:t xml:space="preserve"> </w:t>
-      </w:r>
-      <w:proofErr w:type="gramStart"/>
-      <w:r>
-        <w:rPr>
-          <w:rFonts w:cs="Courier New"/>
-        </w:rPr>
-        <w:t>Kang KC, Cohen SG, Hess JA, Novak WE, Peterson AS.</w:t>
-      </w:r>
-      <w:proofErr w:type="gramEnd"/>
-      <w:r>
-        <w:rPr>
-          <w:rFonts w:cs="Courier New"/>
-        </w:rPr>
-        <w:t xml:space="preserve"> </w:t>
-      </w:r>
-      <w:proofErr w:type="gramStart"/>
-      <w:r>
-        <w:rPr>
-          <w:rFonts w:cs="Courier New"/>
-        </w:rPr>
-        <w:t>Feature-Oriented Domain Analysis (FODA) - Feasibility Study.</w:t>
-      </w:r>
-      <w:proofErr w:type="gramEnd"/>
-      <w:r>
-        <w:rPr>
-          <w:rFonts w:cs="Courier New"/>
-        </w:rPr>
-        <w:t xml:space="preserve"> </w:t>
-      </w:r>
-      <w:proofErr w:type="gramStart"/>
+        <w:t xml:space="preserve">Kang KC, Cohen SG, Hess JA, Novak WE, Peterson AS. Feature-Oriented Domain Analysis (FODA) - Feasibility Study. </w:t>
+      </w:r>
       <w:r>
         <w:rPr>
           <w:rFonts w:cs="Courier New"/>
@@ -1347,41 +1330,17 @@
         <w:rPr>
           <w:rFonts w:cs="Courier New"/>
         </w:rPr>
-        <w:t>, The Software Engineering Institute 1990.</w:t>
-      </w:r>
-      <w:proofErr w:type="gramEnd"/>
-      <w:r>
-        <w:rPr>
-          <w:rFonts w:cs="Courier New"/>
-        </w:rPr>
-        <w:t xml:space="preserve"> </w:t>
-      </w:r>
-      <w:proofErr w:type="gramStart"/>
-      <w:r>
-        <w:rPr>
-          <w:rFonts w:cs="Courier New"/>
-        </w:rPr>
-        <w:t>URL http://www.sei.cmu.edu/ reports/90tr021.pdf.</w:t>
-      </w:r>
-      <w:proofErr w:type="gramEnd"/>
-      <w:r>
-        <w:rPr>
-          <w:rFonts w:cs="Courier New"/>
-        </w:rPr>
-        <w:t xml:space="preserve"> </w:t>
-      </w:r>
-    </w:p>
-    <w:p>
-      <w:pPr>
-        <w:rPr>
-          <w:rFonts w:ascii="Courier New" w:hAnsi="Courier New" w:cs="Courier New"/>
-        </w:rPr>
-      </w:pPr>
-    </w:p>
-    <w:p>
-      <w:bookmarkStart w:id="0" w:name="_GoBack"/>
-      <w:bookmarkEnd w:id="0"/>
-    </w:p>
+        <w:t xml:space="preserve">, The Software Engineering Institute 1990. URL http://www.sei.cmu.edu/ reports/90tr021.pdf. </w:t>
+      </w:r>
+    </w:p>
+    <w:p>
+      <w:pPr>
+        <w:rPr>
+          <w:rFonts w:ascii="Courier New" w:hAnsi="Courier New" w:cs="Courier New"/>
+        </w:rPr>
+      </w:pPr>
+    </w:p>
+    <w:p/>
     <w:sectPr>
       <w:pgSz w:w="11900" w:h="16840"/>
       <w:pgMar w:top="1440" w:right="1800" w:bottom="1440" w:left="1800" w:header="708" w:footer="708" w:gutter="0"/>

</xml_diff>